<commit_message>
Stage 4.5: cover letter terminology sync; fresh mechanical verification ALL PASS (42 T8 cells, 72 Appendix A values, near-dup figures, prose claims)
Co-Authored-By: Claude Fable 5 <noreply@anthropic.com>
</commit_message>
<xml_diff>
--- a/JICTASA-2026-018-Finistral_AI_Cover_Letter.docx
+++ b/JICTASA-2026-018-Finistral_AI_Cover_Letter.docx
@@ -366,13 +366,19 @@
         <w:t xml:space="preserve"> </w:t>
       </w:r>
       <w:r>
-        <w:t xml:space="preserve">on a decontaminated, leakage-free subset of Financial PhraseBank</w:t>
-      </w:r>
-      <w:r>
-        <w:t xml:space="preserve"> </w:t>
-      </w:r>
-      <w:r>
-        <w:t xml:space="preserve">(560 unseen sentences) and on two external datasets decontaminated row-by-row</w:t>
+        <w:t xml:space="preserve">on an exact-match-decontaminated subset of Financial PhraseBank</w:t>
+      </w:r>
+      <w:r>
+        <w:t xml:space="preserve"> </w:t>
+      </w:r>
+      <w:r>
+        <w:t xml:space="preserve">(560 sentences, with a released near-duplicate audit bounding residual overlap)</w:t>
+      </w:r>
+      <w:r>
+        <w:t xml:space="preserve"> </w:t>
+      </w:r>
+      <w:r>
+        <w:t xml:space="preserve">and on two external datasets decontaminated row-by-row</w:t>
       </w:r>
       <w:r>
         <w:t xml:space="preserve"> </w:t>

</xml_diff>